<commit_message>
Refactor analytics code and update plots
</commit_message>
<xml_diff>
--- a/finalreport.docx
+++ b/finalreport.docx
@@ -48,15 +48,6 @@
         </w:rPr>
         <w:t xml:space="preserve">ABSTRACT</w:t>
       </w:r>
-      <w:r>
-        <w:rPr>
-          <w:rFonts w:ascii="Times" w:hAnsi="Times" w:cs="Times"/>
-          <w:sz w:val="24"/>
-          <w:sz-cs w:val="24"/>
-          <w:spacing w:val="0"/>
-        </w:rPr>
-        <w:t xml:space="preserve"/>
-      </w:r>
     </w:p>
     <w:p>
       <w:pPr>
@@ -301,7 +292,7 @@
           <w:sz w:val="24"/>
           <w:sz-cs w:val="24"/>
         </w:rPr>
-        <w:t xml:space="preserve">RQ 3: Does the age difference between partners correlate with perceived attractiveness ratings?</w:t>
+        <w:t xml:space="preserve">Q 3: Does the age difference between partners correlate with perceived attractiveness ratings?</w:t>
       </w:r>
     </w:p>
     <w:p>

</xml_diff>